<commit_message>
Add design diagrams and update ERD/docs for SDS
</commit_message>
<xml_diff>
--- a/Documents/02_Requirements/Report3_CLS_Software Requirement Specification.docx
+++ b/Documents/02_Requirements/Report3_CLS_Software Requirement Specification.docx
@@ -7479,6 +7479,7 @@
       <w:r>
         <w:rPr>
           <w:i/>
+          <w:noProof/>
         </w:rPr>
         <w:drawing>
           <wp:inline distT="0" distB="0" distL="0" distR="0" wp14:anchorId="38860C33" wp14:editId="26304F82">
@@ -7599,17 +7600,14 @@
         <w:t>.2.3</w:t>
       </w:r>
       <w:r>
-        <w:t xml:space="preserve"> </w:t>
-      </w:r>
-      <w:r>
-        <w:t xml:space="preserve">UCs for </w:t>
-      </w:r>
-      <w:r>
-        <w:t>Email Gateway</w:t>
+        <w:t xml:space="preserve"> UCs for Email Gateway</w:t>
       </w:r>
     </w:p>
     <w:p>
       <w:r>
+        <w:rPr>
+          <w:noProof/>
+        </w:rPr>
         <w:drawing>
           <wp:inline distT="0" distB="0" distL="0" distR="0" wp14:anchorId="003A2DF7" wp14:editId="5301FDC6">
             <wp:extent cx="4458086" cy="2301439"/>
@@ -7652,14 +7650,14 @@
         <w:pStyle w:val="Heading5"/>
       </w:pPr>
       <w:r>
-        <w:t xml:space="preserve">1.3.2.3 UCs for </w:t>
-      </w:r>
-      <w:r>
-        <w:t>System Timer</w:t>
+        <w:t>1.3.2.3 UCs for System Timer</w:t>
       </w:r>
     </w:p>
     <w:p>
       <w:r>
+        <w:rPr>
+          <w:noProof/>
+        </w:rPr>
         <w:drawing>
           <wp:inline distT="0" distB="0" distL="0" distR="0" wp14:anchorId="25C43AC4" wp14:editId="7FA9DA0C">
             <wp:extent cx="4602480" cy="1936365"/>
@@ -9574,14 +9572,11 @@
         <w:jc w:val="center"/>
       </w:pPr>
       <w:r>
-        <w:rPr>
-          <w:noProof/>
-        </w:rPr>
         <w:drawing>
-          <wp:inline distT="0" distB="0" distL="0" distR="0" wp14:anchorId="16B5DF24" wp14:editId="5A3E187B">
-            <wp:extent cx="5746750" cy="3408045"/>
-            <wp:effectExtent l="0" t="0" r="6350" b="1905"/>
-            <wp:docPr id="1656051894" name="Picture 1"/>
+          <wp:inline distT="0" distB="0" distL="0" distR="0" wp14:anchorId="0A9BF382" wp14:editId="583CF69B">
+            <wp:extent cx="5746750" cy="2950210"/>
+            <wp:effectExtent l="0" t="0" r="6350" b="2540"/>
+            <wp:docPr id="920994846" name="Picture 1"/>
             <wp:cNvGraphicFramePr>
               <a:graphicFrameLocks xmlns:a="http://schemas.openxmlformats.org/drawingml/2006/main" noChangeAspect="1"/>
             </wp:cNvGraphicFramePr>
@@ -9589,7 +9584,7 @@
               <a:graphicData uri="http://schemas.openxmlformats.org/drawingml/2006/picture">
                 <pic:pic xmlns:pic="http://schemas.openxmlformats.org/drawingml/2006/picture">
                   <pic:nvPicPr>
-                    <pic:cNvPr id="1656051894" name=""/>
+                    <pic:cNvPr id="920994846" name=""/>
                     <pic:cNvPicPr/>
                   </pic:nvPicPr>
                   <pic:blipFill>
@@ -9601,7 +9596,7 @@
                   <pic:spPr>
                     <a:xfrm>
                       <a:off x="0" y="0"/>
-                      <a:ext cx="5746750" cy="3408045"/>
+                      <a:ext cx="5746750" cy="2950210"/>
                     </a:xfrm>
                     <a:prstGeom prst="rect">
                       <a:avLst/>
@@ -10171,7 +10166,6 @@
               </w:rPr>
             </w:pPr>
             <w:r>
-              <w:lastRenderedPageBreak/>
               <w:t>10</w:t>
             </w:r>
           </w:p>
@@ -10222,6 +10216,7 @@
               </w:rPr>
             </w:pPr>
             <w:r>
+              <w:lastRenderedPageBreak/>
               <w:t>11</w:t>
             </w:r>
           </w:p>
@@ -11107,7 +11102,6 @@
                 <w:rFonts w:ascii="Times New Roman" w:hAnsi="Times New Roman"/>
                 <w:color w:val="000000"/>
               </w:rPr>
-              <w:lastRenderedPageBreak/>
               <w:t>Normal Sequence/Flow</w:t>
             </w:r>
           </w:p>
@@ -11153,6 +11147,13 @@
                 <w:color w:val="000000"/>
               </w:rPr>
               <w:br/>
+            </w:r>
+            <w:r>
+              <w:rPr>
+                <w:rFonts w:ascii="Times New Roman" w:hAnsi="Times New Roman"/>
+                <w:color w:val="000000"/>
+              </w:rPr>
+              <w:lastRenderedPageBreak/>
               <w:t>4. System validates the inputs and saves the change.</w:t>
             </w:r>
             <w:r>
@@ -11186,6 +11187,7 @@
                 <w:rFonts w:ascii="Times New Roman" w:hAnsi="Times New Roman"/>
                 <w:color w:val="000000"/>
               </w:rPr>
+              <w:lastRenderedPageBreak/>
               <w:t>Alternative Sequences/Flows</w:t>
             </w:r>
           </w:p>
@@ -12007,7 +12009,6 @@
       </w:pPr>
       <w:bookmarkStart w:id="17" w:name="_Toc227422459"/>
       <w:r>
-        <w:lastRenderedPageBreak/>
         <w:t>2.3.2 UC-05: Resolve Scheduling Conflicts</w:t>
       </w:r>
       <w:bookmarkEnd w:id="17"/>
@@ -12143,6 +12144,7 @@
                 <w:rFonts w:ascii="Times New Roman" w:hAnsi="Times New Roman"/>
                 <w:color w:val="000000"/>
               </w:rPr>
+              <w:lastRenderedPageBreak/>
               <w:t>Description</w:t>
             </w:r>
           </w:p>
@@ -13023,7 +13025,6 @@
                 <w:rFonts w:ascii="Times New Roman" w:hAnsi="Times New Roman"/>
                 <w:color w:val="000000"/>
               </w:rPr>
-              <w:lastRenderedPageBreak/>
               <w:t>Postconditions</w:t>
             </w:r>
           </w:p>
@@ -13070,6 +13071,7 @@
                 <w:rFonts w:ascii="Times New Roman" w:hAnsi="Times New Roman"/>
                 <w:color w:val="000000"/>
               </w:rPr>
+              <w:lastRenderedPageBreak/>
               <w:t>Normal Sequence/Flow</w:t>
             </w:r>
           </w:p>
@@ -13926,7 +13928,6 @@
                 <w:rFonts w:ascii="Times New Roman" w:hAnsi="Times New Roman"/>
                 <w:color w:val="000000"/>
               </w:rPr>
-              <w:lastRenderedPageBreak/>
               <w:t>Alternative Sequences/Flows</w:t>
             </w:r>
           </w:p>
@@ -13960,6 +13961,7 @@
       </w:pPr>
       <w:bookmarkStart w:id="25" w:name="_Toc227422467"/>
       <w:r>
+        <w:lastRenderedPageBreak/>
         <w:t>2.7 System Automation</w:t>
       </w:r>
       <w:bookmarkEnd w:id="25"/>

</xml_diff>

<commit_message>
Add CLS requirements, workflows, and reports
</commit_message>
<xml_diff>
--- a/Documents/02_Requirements/Report3_CLS_Software Requirement Specification.docx
+++ b/Documents/02_Requirements/Report3_CLS_Software Requirement Specification.docx
@@ -25,7 +25,7 @@
                     <pic:cNvPicPr preferRelativeResize="0"/>
                   </pic:nvPicPr>
                   <pic:blipFill>
-                    <a:blip r:embed="rId8"/>
+                    <a:blip r:embed="rId9"/>
                     <a:srcRect/>
                     <a:stretch>
                       <a:fillRect/>
@@ -5724,9 +5724,9 @@
           <w:noProof/>
         </w:rPr>
         <w:drawing>
-          <wp:inline distT="0" distB="0" distL="0" distR="0" wp14:anchorId="7F08CB1F" wp14:editId="0F655CAD">
+          <wp:inline distT="0" distB="0" distL="0" distR="0" wp14:anchorId="7F08CB1F" wp14:editId="0BEDEB53">
             <wp:extent cx="5746750" cy="2613025"/>
-            <wp:effectExtent l="0" t="0" r="6350" b="0"/>
+            <wp:effectExtent l="19050" t="19050" r="25400" b="15875"/>
             <wp:docPr id="486533044" name="Picture 1"/>
             <wp:cNvGraphicFramePr>
               <a:graphicFrameLocks xmlns:a="http://schemas.openxmlformats.org/drawingml/2006/main" noChangeAspect="1"/>
@@ -5739,7 +5739,7 @@
                     <pic:cNvPicPr/>
                   </pic:nvPicPr>
                   <pic:blipFill>
-                    <a:blip r:embed="rId9"/>
+                    <a:blip r:embed="rId10"/>
                     <a:stretch>
                       <a:fillRect/>
                     </a:stretch>
@@ -5752,6 +5752,13 @@
                     <a:prstGeom prst="rect">
                       <a:avLst/>
                     </a:prstGeom>
+                    <a:ln>
+                      <a:solidFill>
+                        <a:schemeClr val="bg1">
+                          <a:lumMod val="85000"/>
+                        </a:schemeClr>
+                      </a:solidFill>
+                    </a:ln>
                   </pic:spPr>
                 </pic:pic>
               </a:graphicData>
@@ -5813,7 +5820,7 @@
                     <pic:cNvPicPr preferRelativeResize="0"/>
                   </pic:nvPicPr>
                   <pic:blipFill>
-                    <a:blip r:embed="rId10"/>
+                    <a:blip r:embed="rId11"/>
                     <a:srcRect/>
                     <a:stretch>
                       <a:fillRect/>
@@ -7497,7 +7504,7 @@
                     <pic:cNvPicPr/>
                   </pic:nvPicPr>
                   <pic:blipFill>
-                    <a:blip r:embed="rId11"/>
+                    <a:blip r:embed="rId12"/>
                     <a:stretch>
                       <a:fillRect/>
                     </a:stretch>
@@ -7564,7 +7571,7 @@
                     <pic:cNvPicPr/>
                   </pic:nvPicPr>
                   <pic:blipFill>
-                    <a:blip r:embed="rId12"/>
+                    <a:blip r:embed="rId13"/>
                     <a:stretch>
                       <a:fillRect/>
                     </a:stretch>
@@ -7624,7 +7631,7 @@
                     <pic:cNvPicPr/>
                   </pic:nvPicPr>
                   <pic:blipFill>
-                    <a:blip r:embed="rId13"/>
+                    <a:blip r:embed="rId14"/>
                     <a:stretch>
                       <a:fillRect/>
                     </a:stretch>
@@ -7674,7 +7681,7 @@
                     <pic:cNvPicPr/>
                   </pic:nvPicPr>
                   <pic:blipFill>
-                    <a:blip r:embed="rId14"/>
+                    <a:blip r:embed="rId15"/>
                     <a:stretch>
                       <a:fillRect/>
                     </a:stretch>
@@ -7737,7 +7744,7 @@
                     <pic:cNvPicPr/>
                   </pic:nvPicPr>
                   <pic:blipFill>
-                    <a:blip r:embed="rId15"/>
+                    <a:blip r:embed="rId16"/>
                     <a:stretch>
                       <a:fillRect/>
                     </a:stretch>
@@ -9276,7 +9283,15 @@
               <w:spacing w:after="0"/>
             </w:pPr>
             <w:r>
-              <w:t>A background cron job that runs daily to count remaining curriculum sessions, automatically flagging profiles that drop below the 2-week threshold into the Admin's renewal alert queue.</w:t>
+              <w:t xml:space="preserve">A background cron job that runs daily to count remaining curriculum sessions, automatically flagging profiles that drop below the 2-week threshold into the </w:t>
+            </w:r>
+            <w:proofErr w:type="gramStart"/>
+            <w:r>
+              <w:t>Admin's</w:t>
+            </w:r>
+            <w:proofErr w:type="gramEnd"/>
+            <w:r>
+              <w:t xml:space="preserve"> renewal alert queue.</w:t>
             </w:r>
           </w:p>
         </w:tc>
@@ -9438,7 +9453,15 @@
               <w:spacing w:after="0"/>
             </w:pPr>
             <w:r>
-              <w:t>An API-driven hook that formats and instantly sends a zero-touch attendance/absence report to the Parent's registered email once a Teacher commits the session data.</w:t>
+              <w:t xml:space="preserve">An API-driven hook that formats and instantly sends a zero-touch attendance/absence report to the Parent's registered email once a </w:t>
+            </w:r>
+            <w:proofErr w:type="gramStart"/>
+            <w:r>
+              <w:t>Teacher</w:t>
+            </w:r>
+            <w:proofErr w:type="gramEnd"/>
+            <w:r>
+              <w:t xml:space="preserve"> commits the session data.</w:t>
             </w:r>
           </w:p>
         </w:tc>
@@ -9572,6 +9595,9 @@
         <w:jc w:val="center"/>
       </w:pPr>
       <w:r>
+        <w:rPr>
+          <w:noProof/>
+        </w:rPr>
         <w:drawing>
           <wp:inline distT="0" distB="0" distL="0" distR="0" wp14:anchorId="0A9BF382" wp14:editId="583CF69B">
             <wp:extent cx="5746750" cy="2950210"/>
@@ -9588,7 +9614,7 @@
                     <pic:cNvPicPr/>
                   </pic:nvPicPr>
                   <pic:blipFill>
-                    <a:blip r:embed="rId16"/>
+                    <a:blip r:embed="rId17"/>
                     <a:stretch>
                       <a:fillRect/>
                     </a:stretch>
@@ -10349,7 +10375,15 @@
               </w:rPr>
             </w:pPr>
             <w:r>
-              <w:t>Logs offline/online tuition fee transactions, tracking the amounts paid against a Student_Package by the Academic Admin.</w:t>
+              <w:t xml:space="preserve">Logs offline/online tuition fee transactions, tracking the amounts paid against a </w:t>
+            </w:r>
+            <w:proofErr w:type="gramStart"/>
+            <w:r>
+              <w:t>Student</w:t>
+            </w:r>
+            <w:proofErr w:type="gramEnd"/>
+            <w:r>
+              <w:t>_Package by the Academic Admin.</w:t>
             </w:r>
           </w:p>
         </w:tc>
@@ -10771,7 +10805,23 @@
                 <w:color w:val="000000"/>
               </w:rPr>
               <w:br/>
-              <w:t>6. System saves the record and navigates to the Student detail view.</w:t>
+              <w:t xml:space="preserve">6. System saves the record and navigates to the </w:t>
+            </w:r>
+            <w:proofErr w:type="gramStart"/>
+            <w:r>
+              <w:rPr>
+                <w:rFonts w:ascii="Times New Roman" w:hAnsi="Times New Roman"/>
+                <w:color w:val="000000"/>
+              </w:rPr>
+              <w:t>Student</w:t>
+            </w:r>
+            <w:proofErr w:type="gramEnd"/>
+            <w:r>
+              <w:rPr>
+                <w:rFonts w:ascii="Times New Roman" w:hAnsi="Times New Roman"/>
+                <w:color w:val="000000"/>
+              </w:rPr>
+              <w:t xml:space="preserve"> detail view.</w:t>
             </w:r>
           </w:p>
         </w:tc>
@@ -14290,7 +14340,23 @@
                 <w:color w:val="000000"/>
               </w:rPr>
               <w:br/>
-              <w:t>4. If Remaining &lt;= 2 weeks equivalent, System logically checks if an Alert already exists.</w:t>
+              <w:t xml:space="preserve">4. If </w:t>
+            </w:r>
+            <w:proofErr w:type="gramStart"/>
+            <w:r>
+              <w:rPr>
+                <w:rFonts w:ascii="Times New Roman" w:hAnsi="Times New Roman"/>
+                <w:color w:val="000000"/>
+              </w:rPr>
+              <w:t>Remaining</w:t>
+            </w:r>
+            <w:proofErr w:type="gramEnd"/>
+            <w:r>
+              <w:rPr>
+                <w:rFonts w:ascii="Times New Roman" w:hAnsi="Times New Roman"/>
+                <w:color w:val="000000"/>
+              </w:rPr>
+              <w:t xml:space="preserve"> &lt;= 2 weeks equivalent, System logically checks if an Alert already exists.</w:t>
             </w:r>
             <w:r>
               <w:rPr>
@@ -14809,7 +14875,7 @@
                     <pic:cNvPicPr/>
                   </pic:nvPicPr>
                   <pic:blipFill>
-                    <a:blip r:embed="rId17"/>
+                    <a:blip r:embed="rId18"/>
                     <a:stretch>
                       <a:fillRect/>
                     </a:stretch>
@@ -15083,7 +15149,7 @@
                     <pic:cNvPicPr/>
                   </pic:nvPicPr>
                   <pic:blipFill>
-                    <a:blip r:embed="rId18"/>
+                    <a:blip r:embed="rId19"/>
                     <a:stretch>
                       <a:fillRect/>
                     </a:stretch>
@@ -15107,7 +15173,21 @@
         <w:rPr>
           <w:rFonts w:ascii="Times New Roman" w:hAnsi="Times New Roman"/>
         </w:rPr>
-        <w:t>This interface allows the Admin to comprehensively view, mathematically edit, or logically deactivate existing student profiles. Maps to UC-02: Update Student Lifecycles.</w:t>
+        <w:t xml:space="preserve">This interface allows the </w:t>
+      </w:r>
+      <w:proofErr w:type="gramStart"/>
+      <w:r>
+        <w:rPr>
+          <w:rFonts w:ascii="Times New Roman" w:hAnsi="Times New Roman"/>
+        </w:rPr>
+        <w:t>Admin</w:t>
+      </w:r>
+      <w:proofErr w:type="gramEnd"/>
+      <w:r>
+        <w:rPr>
+          <w:rFonts w:ascii="Times New Roman" w:hAnsi="Times New Roman"/>
+        </w:rPr>
+        <w:t xml:space="preserve"> to comprehensively view, mathematically edit, or logically deactivate existing student profiles. Maps to UC-02: Update Student Lifecycles.</w:t>
       </w:r>
     </w:p>
     <w:p>
@@ -15307,7 +15387,7 @@
                     <pic:cNvPicPr/>
                   </pic:nvPicPr>
                   <pic:blipFill>
-                    <a:blip r:embed="rId19"/>
+                    <a:blip r:embed="rId20"/>
                     <a:stretch>
                       <a:fillRect/>
                     </a:stretch>
@@ -15561,7 +15641,7 @@
                     <pic:cNvPicPr/>
                   </pic:nvPicPr>
                   <pic:blipFill>
-                    <a:blip r:embed="rId20"/>
+                    <a:blip r:embed="rId21"/>
                     <a:stretch>
                       <a:fillRect/>
                     </a:stretch>
@@ -15835,7 +15915,7 @@
                     <pic:cNvPicPr/>
                   </pic:nvPicPr>
                   <pic:blipFill>
-                    <a:blip r:embed="rId21"/>
+                    <a:blip r:embed="rId22"/>
                     <a:stretch>
                       <a:fillRect/>
                     </a:stretch>
@@ -16028,7 +16108,7 @@
                     <pic:cNvPicPr/>
                   </pic:nvPicPr>
                   <pic:blipFill>
-                    <a:blip r:embed="rId22"/>
+                    <a:blip r:embed="rId23"/>
                     <a:stretch>
                       <a:fillRect/>
                     </a:stretch>
@@ -16282,7 +16362,7 @@
                     <pic:cNvPicPr/>
                   </pic:nvPicPr>
                   <pic:blipFill>
-                    <a:blip r:embed="rId23"/>
+                    <a:blip r:embed="rId24"/>
                     <a:stretch>
                       <a:fillRect/>
                     </a:stretch>
@@ -16466,7 +16546,7 @@
                     <pic:cNvPicPr/>
                   </pic:nvPicPr>
                   <pic:blipFill>
-                    <a:blip r:embed="rId24"/>
+                    <a:blip r:embed="rId25"/>
                     <a:stretch>
                       <a:fillRect/>
                     </a:stretch>
@@ -16690,7 +16770,7 @@
                     <pic:cNvPicPr/>
                   </pic:nvPicPr>
                   <pic:blipFill>
-                    <a:blip r:embed="rId25"/>
+                    <a:blip r:embed="rId26"/>
                     <a:stretch>
                       <a:fillRect/>
                     </a:stretch>
@@ -17290,7 +17370,23 @@
                 <w:rFonts w:ascii="Times New Roman" w:hAnsi="Times New Roman"/>
                 <w:color w:val="000000"/>
               </w:rPr>
-              <w:t>Isolation Protocol (Security Policy): Administrators securely processing Financial workflows physically cannot manipulate strictly isolated Teacher academic evaluation inputs, ensuring pristine cross-domain RBAC integrity.</w:t>
+              <w:t xml:space="preserve">Isolation Protocol (Security Policy): Administrators securely processing </w:t>
+            </w:r>
+            <w:proofErr w:type="gramStart"/>
+            <w:r>
+              <w:rPr>
+                <w:rFonts w:ascii="Times New Roman" w:hAnsi="Times New Roman"/>
+                <w:color w:val="000000"/>
+              </w:rPr>
+              <w:t>Financial</w:t>
+            </w:r>
+            <w:proofErr w:type="gramEnd"/>
+            <w:r>
+              <w:rPr>
+                <w:rFonts w:ascii="Times New Roman" w:hAnsi="Times New Roman"/>
+                <w:color w:val="000000"/>
+              </w:rPr>
+              <w:t xml:space="preserve"> workflows physically cannot manipulate strictly isolated Teacher academic evaluation inputs, ensuring pristine cross-domain RBAC integrity.</w:t>
             </w:r>
           </w:p>
         </w:tc>
@@ -17765,7 +17861,7 @@
     </w:tbl>
     <w:p/>
     <w:sectPr>
-      <w:footerReference w:type="default" r:id="rId26"/>
+      <w:footerReference w:type="default" r:id="rId27"/>
       <w:pgSz w:w="11906" w:h="16838"/>
       <w:pgMar w:top="1440" w:right="1416" w:bottom="1440" w:left="1440" w:header="708" w:footer="708" w:gutter="0"/>
       <w:pgNumType w:start="1"/>
@@ -20830,6 +20926,10 @@
 </go:gDocsCustomXmlDataStorage>
 </file>
 
+<file path=customXml/item2.xml><?xml version="1.0" encoding="utf-8"?>
+<b:Sources xmlns:b="http://schemas.openxmlformats.org/officeDocument/2006/bibliography" xmlns="http://schemas.openxmlformats.org/officeDocument/2006/bibliography" SelectedStyle="\APASixthEditionOfficeOnline.xsl" StyleName="APA" Version="6"/>
+</file>
+
 <file path=customXml/itemProps1.xml><?xml version="1.0" encoding="utf-8"?>
 <ds:datastoreItem xmlns:ds="http://schemas.openxmlformats.org/officeDocument/2006/customXml" ds:itemID="{11111111-1234-1234-1234-123412341234}">
   <ds:schemaRefs>
@@ -20837,4 +20937,12 @@
     <ds:schemaRef ds:uri="http://schemas.openxmlformats.org/officeDocument/2006/relationships"/>
   </ds:schemaRefs>
 </ds:datastoreItem>
+</file>
+
+<file path=customXml/itemProps2.xml><?xml version="1.0" encoding="utf-8"?>
+<ds:datastoreItem xmlns:ds="http://schemas.openxmlformats.org/officeDocument/2006/customXml" ds:itemID="{2D31F2B5-80C2-4A75-BB90-72309AE17A45}">
+  <ds:schemaRefs>
+    <ds:schemaRef ds:uri="http://schemas.openxmlformats.org/officeDocument/2006/bibliography"/>
+  </ds:schemaRefs>
+</ds:datastoreItem>
 </file>
</xml_diff>